<commit_message>
table titles (subheadings) fix
</commit_message>
<xml_diff>
--- a/inquiries-output/تقرير تحليل استفسارات المتعاملين .docx
+++ b/inquiries-output/تقرير تحليل استفسارات المتعاملين .docx
@@ -830,9 +830,8 @@
         <w:bidi/>
         <w:spacing w:before="80" w:after="80" w:line="360" w:lineRule="auto"/>
         <w:rPr>
-          <w:rFonts w:hint="cs"/>
           <w:rtl/>
-          <w:lang w:val="en-AE" w:bidi="ar-AE"/>
+          <w:lang w:bidi="ar-AE"/>
         </w:rPr>
       </w:pPr>
       <w:r>
@@ -852,7 +851,7 @@
           <w:sz w:val="20"/>
           <w:szCs w:val="20"/>
           <w:rtl/>
-          <w:lang w:val="en-AE" w:bidi="ar-AE"/>
+          <w:lang w:bidi="ar-AE"/>
         </w:rPr>
         <w:t>.</w:t>
       </w:r>
@@ -6728,13 +6727,21 @@
       <w:pPr>
         <w:bidi/>
         <w:spacing w:before="80" w:after="80" w:line="360" w:lineRule="auto"/>
+        <w:rPr>
+          <w:b/>
+          <w:bCs/>
+          <w:sz w:val="26"/>
+          <w:szCs w:val="26"/>
+        </w:rPr>
       </w:pPr>
       <w:r>
         <w:rPr>
           <w:rFonts w:ascii="Dubai" w:hAnsi="Dubai" w:cs="Dubai"/>
+          <w:b/>
+          <w:bCs/>
           <w:color w:val="404040"/>
-          <w:sz w:val="20"/>
-          <w:szCs w:val="20"/>
+          <w:sz w:val="26"/>
+          <w:szCs w:val="26"/>
           <w:rtl/>
         </w:rPr>
         <w:t>أبرز الطلبات المقدَّمة عبر شرطة الفجيرة (198 حالة — 18.3%):</w:t>
@@ -8156,13 +8163,21 @@
       <w:pPr>
         <w:bidi/>
         <w:spacing w:before="80" w:after="80" w:line="360" w:lineRule="auto"/>
+        <w:rPr>
+          <w:b/>
+          <w:bCs/>
+          <w:sz w:val="26"/>
+          <w:szCs w:val="26"/>
+        </w:rPr>
       </w:pPr>
       <w:r>
         <w:rPr>
           <w:rFonts w:ascii="Dubai" w:hAnsi="Dubai" w:cs="Dubai"/>
+          <w:b/>
+          <w:bCs/>
           <w:color w:val="404040"/>
-          <w:sz w:val="20"/>
-          <w:szCs w:val="20"/>
+          <w:sz w:val="26"/>
+          <w:szCs w:val="26"/>
           <w:rtl/>
         </w:rPr>
         <w:t>أبرز الاستفسارات المتكررة (329 حالة — 30.4%):</w:t>
@@ -10889,12 +10904,12 @@
         <w:bidi/>
         <w:spacing w:before="80" w:after="80" w:line="360" w:lineRule="auto"/>
         <w:rPr>
-          <w:rFonts w:ascii="Dubai" w:hAnsi="Dubai" w:cs="Dubai" w:hint="cs"/>
+          <w:rFonts w:ascii="Dubai" w:hAnsi="Dubai" w:cs="Dubai"/>
           <w:color w:val="404040"/>
           <w:sz w:val="20"/>
           <w:szCs w:val="20"/>
           <w:rtl/>
-          <w:lang w:val="en-AE" w:bidi="ar-AE"/>
+          <w:lang w:bidi="ar-AE"/>
         </w:rPr>
       </w:pPr>
       <w:r>
@@ -10926,7 +10941,7 @@
           <w:sz w:val="20"/>
           <w:szCs w:val="20"/>
           <w:rtl/>
-          <w:lang w:val="en-AE" w:bidi="ar-AE"/>
+          <w:lang w:bidi="ar-AE"/>
         </w:rPr>
         <w:t>.</w:t>
       </w:r>
@@ -11638,7 +11653,7 @@
               <w:bidi/>
               <w:jc w:val="center"/>
               <w:rPr>
-                <w:rFonts w:ascii="Dubai" w:eastAsia="Times New Roman" w:hAnsi="Dubai" w:cs="Dubai" w:hint="cs"/>
+                <w:rFonts w:ascii="Dubai" w:eastAsia="Times New Roman" w:hAnsi="Dubai" w:cs="Dubai"/>
                 <w:color w:val="000000"/>
                 <w:sz w:val="19"/>
                 <w:szCs w:val="19"/>
@@ -12806,7 +12821,7 @@
                 <w:sz w:val="19"/>
                 <w:szCs w:val="19"/>
                 <w:rtl/>
-                <w:lang w:val="en-AE" w:bidi="ar-AE"/>
+                <w:lang w:bidi="ar-AE"/>
               </w:rPr>
               <w:t xml:space="preserve"> بعض</w:t>
             </w:r>
@@ -21776,7 +21791,7 @@
 <file path=word/charts/chart1.xml><?xml version="1.0" encoding="utf-8"?>
 <c:chartSpace xmlns:c="http://schemas.openxmlformats.org/drawingml/2006/chart" xmlns:a="http://schemas.openxmlformats.org/drawingml/2006/main" xmlns:r="http://schemas.openxmlformats.org/officeDocument/2006/relationships" xmlns:c16r2="http://schemas.microsoft.com/office/drawing/2015/06/chart">
   <c:date1904 val="0"/>
-  <c:lang val="en-GB"/>
+  <c:lang val="en-US"/>
   <c:roundedCorners val="0"/>
   <mc:AlternateContent xmlns:mc="http://schemas.openxmlformats.org/markup-compatibility/2006">
     <mc:Choice xmlns:c14="http://schemas.microsoft.com/office/drawing/2007/8/2/chart" Requires="c14">

</xml_diff>